<commit_message>
design document and requirments document changed
</commit_message>
<xml_diff>
--- a/plans/Quality Assurance.v2 .docx
+++ b/plans/Quality Assurance.v2 .docx
@@ -11,14 +11,6 @@
       </w:pPr>
       <w:r>
         <w:rPr>
-          <w:rFonts w:ascii="Segoe UI Emoji" w:hAnsi="Segoe UI Emoji" w:cs="Segoe UI Emoji"/>
-          <w:b/>
-          <w:bCs/>
-        </w:rPr>
-        <w:t>📄</w:t>
-      </w:r>
-      <w:r>
-        <w:rPr>
           <w:b/>
           <w:bCs/>
         </w:rPr>
@@ -157,13 +149,8 @@
           <w:numId w:val="2"/>
         </w:numPr>
       </w:pPr>
-      <w:proofErr w:type="spellStart"/>
-      <w:r>
-        <w:t>Şevda</w:t>
-      </w:r>
-      <w:proofErr w:type="spellEnd"/>
-      <w:r>
-        <w:t xml:space="preserve"> Yağmur Asal</w:t>
+      <w:r>
+        <w:t>Şevda Yağmur Asal</w:t>
       </w:r>
     </w:p>
     <w:p>
@@ -317,15 +304,7 @@
         </w:numPr>
       </w:pPr>
       <w:r>
-        <w:t xml:space="preserve">Example: Testing </w:t>
-      </w:r>
-      <w:proofErr w:type="spellStart"/>
-      <w:r>
-        <w:t>register_user</w:t>
-      </w:r>
-      <w:proofErr w:type="spellEnd"/>
-      <w:r>
-        <w:t>() function</w:t>
+        <w:t>Example: Testing register_user() function</w:t>
       </w:r>
     </w:p>
     <w:p>
@@ -338,7 +317,6 @@
       <w:r>
         <w:t xml:space="preserve">Tool: </w:t>
       </w:r>
-      <w:proofErr w:type="spellStart"/>
       <w:r>
         <w:rPr>
           <w:b/>
@@ -346,7 +324,6 @@
         </w:rPr>
         <w:t>pytest</w:t>
       </w:r>
-      <w:proofErr w:type="spellEnd"/>
     </w:p>
     <w:p>
       <w:pPr>
@@ -1858,7 +1835,7 @@
     <w:p>
       <w:r>
         <w:pict w14:anchorId="0F2726F9">
-          <v:rect id="_x0000_i1042" style="width:0;height:1.5pt" o:hralign="center" o:hrstd="t" o:hr="t" fillcolor="#a0a0a0" stroked="f"/>
+          <v:rect id="_x0000_i1032" style="width:0;height:1.5pt" o:hralign="center" o:hrstd="t" o:hr="t" fillcolor="#a0a0a0" stroked="f"/>
         </w:pict>
       </w:r>
     </w:p>
@@ -2091,6 +2068,9 @@
     </w:p>
     <w:p>
       <w:r>
+        <w:rPr>
+          <w:noProof/>
+        </w:rPr>
         <w:drawing>
           <wp:inline distT="0" distB="0" distL="0" distR="0" wp14:anchorId="029F0420" wp14:editId="7868B03C">
             <wp:extent cx="5805578" cy="5059403"/>
@@ -2129,7 +2109,7 @@
       </w:r>
       <w:r>
         <w:pict w14:anchorId="6C0EE423">
-          <v:rect id="_x0000_i1046" style="width:0;height:1.5pt" o:hralign="center" o:hrstd="t" o:hr="t" fillcolor="#a0a0a0" stroked="f"/>
+          <v:rect id="_x0000_i1033" style="width:0;height:1.5pt" o:hralign="center" o:hrstd="t" o:hr="t" fillcolor="#a0a0a0" stroked="f"/>
         </w:pict>
       </w:r>
     </w:p>
@@ -2276,7 +2256,13 @@
         <w:t>Input:</w:t>
       </w:r>
       <w:r>
-        <w:t xml:space="preserve"> Rating between 1–5 and review text</w:t>
+        <w:t xml:space="preserve"> Rating between 1–</w:t>
+      </w:r>
+      <w:r>
+        <w:t>10</w:t>
+      </w:r>
+      <w:r>
+        <w:t xml:space="preserve"> and review text</w:t>
       </w:r>
       <w:r>
         <w:br/>
@@ -2586,11 +2572,9 @@
             <w:hideMark/>
           </w:tcPr>
           <w:p>
-            <w:proofErr w:type="spellStart"/>
             <w:r>
               <w:t>Şevda</w:t>
             </w:r>
-            <w:proofErr w:type="spellEnd"/>
           </w:p>
         </w:tc>
       </w:tr>
@@ -5183,11 +5167,11 @@
     <w:name w:val="Normal"/>
     <w:qFormat/>
   </w:style>
-  <w:style w:type="paragraph" w:styleId="Heading1">
+  <w:style w:type="paragraph" w:styleId="Balk1">
     <w:name w:val="heading 1"/>
     <w:basedOn w:val="Normal"/>
     <w:next w:val="Normal"/>
-    <w:link w:val="Heading1Char"/>
+    <w:link w:val="Balk1Char"/>
     <w:uiPriority w:val="9"/>
     <w:qFormat/>
     <w:rsid w:val="00A65016"/>
@@ -5204,11 +5188,11 @@
       <w:szCs w:val="40"/>
     </w:rPr>
   </w:style>
-  <w:style w:type="paragraph" w:styleId="Heading2">
+  <w:style w:type="paragraph" w:styleId="Balk2">
     <w:name w:val="heading 2"/>
     <w:basedOn w:val="Normal"/>
     <w:next w:val="Normal"/>
-    <w:link w:val="Heading2Char"/>
+    <w:link w:val="Balk2Char"/>
     <w:uiPriority w:val="9"/>
     <w:semiHidden/>
     <w:unhideWhenUsed/>
@@ -5227,11 +5211,11 @@
       <w:szCs w:val="32"/>
     </w:rPr>
   </w:style>
-  <w:style w:type="paragraph" w:styleId="Heading3">
+  <w:style w:type="paragraph" w:styleId="Balk3">
     <w:name w:val="heading 3"/>
     <w:basedOn w:val="Normal"/>
     <w:next w:val="Normal"/>
-    <w:link w:val="Heading3Char"/>
+    <w:link w:val="Balk3Char"/>
     <w:uiPriority w:val="9"/>
     <w:semiHidden/>
     <w:unhideWhenUsed/>
@@ -5250,11 +5234,11 @@
       <w:szCs w:val="28"/>
     </w:rPr>
   </w:style>
-  <w:style w:type="paragraph" w:styleId="Heading4">
+  <w:style w:type="paragraph" w:styleId="Balk4">
     <w:name w:val="heading 4"/>
     <w:basedOn w:val="Normal"/>
     <w:next w:val="Normal"/>
-    <w:link w:val="Heading4Char"/>
+    <w:link w:val="Balk4Char"/>
     <w:uiPriority w:val="9"/>
     <w:semiHidden/>
     <w:unhideWhenUsed/>
@@ -5273,11 +5257,11 @@
       <w:color w:val="0F4761" w:themeColor="accent1" w:themeShade="BF"/>
     </w:rPr>
   </w:style>
-  <w:style w:type="paragraph" w:styleId="Heading5">
+  <w:style w:type="paragraph" w:styleId="Balk5">
     <w:name w:val="heading 5"/>
     <w:basedOn w:val="Normal"/>
     <w:next w:val="Normal"/>
-    <w:link w:val="Heading5Char"/>
+    <w:link w:val="Balk5Char"/>
     <w:uiPriority w:val="9"/>
     <w:semiHidden/>
     <w:unhideWhenUsed/>
@@ -5294,11 +5278,11 @@
       <w:color w:val="0F4761" w:themeColor="accent1" w:themeShade="BF"/>
     </w:rPr>
   </w:style>
-  <w:style w:type="paragraph" w:styleId="Heading6">
+  <w:style w:type="paragraph" w:styleId="Balk6">
     <w:name w:val="heading 6"/>
     <w:basedOn w:val="Normal"/>
     <w:next w:val="Normal"/>
-    <w:link w:val="Heading6Char"/>
+    <w:link w:val="Balk6Char"/>
     <w:uiPriority w:val="9"/>
     <w:semiHidden/>
     <w:unhideWhenUsed/>
@@ -5317,11 +5301,11 @@
       <w:color w:val="595959" w:themeColor="text1" w:themeTint="A6"/>
     </w:rPr>
   </w:style>
-  <w:style w:type="paragraph" w:styleId="Heading7">
+  <w:style w:type="paragraph" w:styleId="Balk7">
     <w:name w:val="heading 7"/>
     <w:basedOn w:val="Normal"/>
     <w:next w:val="Normal"/>
-    <w:link w:val="Heading7Char"/>
+    <w:link w:val="Balk7Char"/>
     <w:uiPriority w:val="9"/>
     <w:semiHidden/>
     <w:unhideWhenUsed/>
@@ -5338,11 +5322,11 @@
       <w:color w:val="595959" w:themeColor="text1" w:themeTint="A6"/>
     </w:rPr>
   </w:style>
-  <w:style w:type="paragraph" w:styleId="Heading8">
+  <w:style w:type="paragraph" w:styleId="Balk8">
     <w:name w:val="heading 8"/>
     <w:basedOn w:val="Normal"/>
     <w:next w:val="Normal"/>
-    <w:link w:val="Heading8Char"/>
+    <w:link w:val="Balk8Char"/>
     <w:uiPriority w:val="9"/>
     <w:semiHidden/>
     <w:unhideWhenUsed/>
@@ -5361,11 +5345,11 @@
       <w:color w:val="272727" w:themeColor="text1" w:themeTint="D8"/>
     </w:rPr>
   </w:style>
-  <w:style w:type="paragraph" w:styleId="Heading9">
+  <w:style w:type="paragraph" w:styleId="Balk9">
     <w:name w:val="heading 9"/>
     <w:basedOn w:val="Normal"/>
     <w:next w:val="Normal"/>
-    <w:link w:val="Heading9Char"/>
+    <w:link w:val="Balk9Char"/>
     <w:uiPriority w:val="9"/>
     <w:semiHidden/>
     <w:unhideWhenUsed/>
@@ -5382,13 +5366,13 @@
       <w:color w:val="272727" w:themeColor="text1" w:themeTint="D8"/>
     </w:rPr>
   </w:style>
-  <w:style w:type="character" w:default="1" w:styleId="DefaultParagraphFont">
+  <w:style w:type="character" w:default="1" w:styleId="VarsaylanParagrafYazTipi">
     <w:name w:val="Default Paragraph Font"/>
     <w:uiPriority w:val="1"/>
     <w:semiHidden/>
     <w:unhideWhenUsed/>
   </w:style>
-  <w:style w:type="table" w:default="1" w:styleId="TableNormal">
+  <w:style w:type="table" w:default="1" w:styleId="NormalTablo">
     <w:name w:val="Normal Table"/>
     <w:uiPriority w:val="99"/>
     <w:semiHidden/>
@@ -5403,16 +5387,16 @@
       </w:tblCellMar>
     </w:tblPr>
   </w:style>
-  <w:style w:type="numbering" w:default="1" w:styleId="NoList">
+  <w:style w:type="numbering" w:default="1" w:styleId="ListeYok">
     <w:name w:val="No List"/>
     <w:uiPriority w:val="99"/>
     <w:semiHidden/>
     <w:unhideWhenUsed/>
   </w:style>
-  <w:style w:type="character" w:customStyle="1" w:styleId="Heading1Char">
-    <w:name w:val="Heading 1 Char"/>
-    <w:basedOn w:val="DefaultParagraphFont"/>
-    <w:link w:val="Heading1"/>
+  <w:style w:type="character" w:customStyle="1" w:styleId="Balk1Char">
+    <w:name w:val="Başlık 1 Char"/>
+    <w:basedOn w:val="VarsaylanParagrafYazTipi"/>
+    <w:link w:val="Balk1"/>
     <w:uiPriority w:val="9"/>
     <w:rsid w:val="00A65016"/>
     <w:rPr>
@@ -5422,10 +5406,10 @@
       <w:szCs w:val="40"/>
     </w:rPr>
   </w:style>
-  <w:style w:type="character" w:customStyle="1" w:styleId="Heading2Char">
-    <w:name w:val="Heading 2 Char"/>
-    <w:basedOn w:val="DefaultParagraphFont"/>
-    <w:link w:val="Heading2"/>
+  <w:style w:type="character" w:customStyle="1" w:styleId="Balk2Char">
+    <w:name w:val="Başlık 2 Char"/>
+    <w:basedOn w:val="VarsaylanParagrafYazTipi"/>
+    <w:link w:val="Balk2"/>
     <w:uiPriority w:val="9"/>
     <w:semiHidden/>
     <w:rsid w:val="00A65016"/>
@@ -5436,10 +5420,10 @@
       <w:szCs w:val="32"/>
     </w:rPr>
   </w:style>
-  <w:style w:type="character" w:customStyle="1" w:styleId="Heading3Char">
-    <w:name w:val="Heading 3 Char"/>
-    <w:basedOn w:val="DefaultParagraphFont"/>
-    <w:link w:val="Heading3"/>
+  <w:style w:type="character" w:customStyle="1" w:styleId="Balk3Char">
+    <w:name w:val="Başlık 3 Char"/>
+    <w:basedOn w:val="VarsaylanParagrafYazTipi"/>
+    <w:link w:val="Balk3"/>
     <w:uiPriority w:val="9"/>
     <w:semiHidden/>
     <w:rsid w:val="00A65016"/>
@@ -5450,10 +5434,10 @@
       <w:szCs w:val="28"/>
     </w:rPr>
   </w:style>
-  <w:style w:type="character" w:customStyle="1" w:styleId="Heading4Char">
-    <w:name w:val="Heading 4 Char"/>
-    <w:basedOn w:val="DefaultParagraphFont"/>
-    <w:link w:val="Heading4"/>
+  <w:style w:type="character" w:customStyle="1" w:styleId="Balk4Char">
+    <w:name w:val="Başlık 4 Char"/>
+    <w:basedOn w:val="VarsaylanParagrafYazTipi"/>
+    <w:link w:val="Balk4"/>
     <w:uiPriority w:val="9"/>
     <w:semiHidden/>
     <w:rsid w:val="00A65016"/>
@@ -5464,10 +5448,10 @@
       <w:color w:val="0F4761" w:themeColor="accent1" w:themeShade="BF"/>
     </w:rPr>
   </w:style>
-  <w:style w:type="character" w:customStyle="1" w:styleId="Heading5Char">
-    <w:name w:val="Heading 5 Char"/>
-    <w:basedOn w:val="DefaultParagraphFont"/>
-    <w:link w:val="Heading5"/>
+  <w:style w:type="character" w:customStyle="1" w:styleId="Balk5Char">
+    <w:name w:val="Başlık 5 Char"/>
+    <w:basedOn w:val="VarsaylanParagrafYazTipi"/>
+    <w:link w:val="Balk5"/>
     <w:uiPriority w:val="9"/>
     <w:semiHidden/>
     <w:rsid w:val="00A65016"/>
@@ -5476,10 +5460,10 @@
       <w:color w:val="0F4761" w:themeColor="accent1" w:themeShade="BF"/>
     </w:rPr>
   </w:style>
-  <w:style w:type="character" w:customStyle="1" w:styleId="Heading6Char">
-    <w:name w:val="Heading 6 Char"/>
-    <w:basedOn w:val="DefaultParagraphFont"/>
-    <w:link w:val="Heading6"/>
+  <w:style w:type="character" w:customStyle="1" w:styleId="Balk6Char">
+    <w:name w:val="Başlık 6 Char"/>
+    <w:basedOn w:val="VarsaylanParagrafYazTipi"/>
+    <w:link w:val="Balk6"/>
     <w:uiPriority w:val="9"/>
     <w:semiHidden/>
     <w:rsid w:val="00A65016"/>
@@ -5490,10 +5474,10 @@
       <w:color w:val="595959" w:themeColor="text1" w:themeTint="A6"/>
     </w:rPr>
   </w:style>
-  <w:style w:type="character" w:customStyle="1" w:styleId="Heading7Char">
-    <w:name w:val="Heading 7 Char"/>
-    <w:basedOn w:val="DefaultParagraphFont"/>
-    <w:link w:val="Heading7"/>
+  <w:style w:type="character" w:customStyle="1" w:styleId="Balk7Char">
+    <w:name w:val="Başlık 7 Char"/>
+    <w:basedOn w:val="VarsaylanParagrafYazTipi"/>
+    <w:link w:val="Balk7"/>
     <w:uiPriority w:val="9"/>
     <w:semiHidden/>
     <w:rsid w:val="00A65016"/>
@@ -5502,10 +5486,10 @@
       <w:color w:val="595959" w:themeColor="text1" w:themeTint="A6"/>
     </w:rPr>
   </w:style>
-  <w:style w:type="character" w:customStyle="1" w:styleId="Heading8Char">
-    <w:name w:val="Heading 8 Char"/>
-    <w:basedOn w:val="DefaultParagraphFont"/>
-    <w:link w:val="Heading8"/>
+  <w:style w:type="character" w:customStyle="1" w:styleId="Balk8Char">
+    <w:name w:val="Başlık 8 Char"/>
+    <w:basedOn w:val="VarsaylanParagrafYazTipi"/>
+    <w:link w:val="Balk8"/>
     <w:uiPriority w:val="9"/>
     <w:semiHidden/>
     <w:rsid w:val="00A65016"/>
@@ -5516,10 +5500,10 @@
       <w:color w:val="272727" w:themeColor="text1" w:themeTint="D8"/>
     </w:rPr>
   </w:style>
-  <w:style w:type="character" w:customStyle="1" w:styleId="Heading9Char">
-    <w:name w:val="Heading 9 Char"/>
-    <w:basedOn w:val="DefaultParagraphFont"/>
-    <w:link w:val="Heading9"/>
+  <w:style w:type="character" w:customStyle="1" w:styleId="Balk9Char">
+    <w:name w:val="Başlık 9 Char"/>
+    <w:basedOn w:val="VarsaylanParagrafYazTipi"/>
+    <w:link w:val="Balk9"/>
     <w:uiPriority w:val="9"/>
     <w:semiHidden/>
     <w:rsid w:val="00A65016"/>
@@ -5528,11 +5512,11 @@
       <w:color w:val="272727" w:themeColor="text1" w:themeTint="D8"/>
     </w:rPr>
   </w:style>
-  <w:style w:type="paragraph" w:styleId="Title">
+  <w:style w:type="paragraph" w:styleId="KonuBal">
     <w:name w:val="Title"/>
     <w:basedOn w:val="Normal"/>
     <w:next w:val="Normal"/>
-    <w:link w:val="TitleChar"/>
+    <w:link w:val="KonuBalChar"/>
     <w:uiPriority w:val="10"/>
     <w:qFormat/>
     <w:rsid w:val="00A65016"/>
@@ -5548,10 +5532,10 @@
       <w:szCs w:val="56"/>
     </w:rPr>
   </w:style>
-  <w:style w:type="character" w:customStyle="1" w:styleId="TitleChar">
-    <w:name w:val="Title Char"/>
-    <w:basedOn w:val="DefaultParagraphFont"/>
-    <w:link w:val="Title"/>
+  <w:style w:type="character" w:customStyle="1" w:styleId="KonuBalChar">
+    <w:name w:val="Konu Başlığı Char"/>
+    <w:basedOn w:val="VarsaylanParagrafYazTipi"/>
+    <w:link w:val="KonuBal"/>
     <w:uiPriority w:val="10"/>
     <w:rsid w:val="00A65016"/>
     <w:rPr>
@@ -5562,11 +5546,11 @@
       <w:szCs w:val="56"/>
     </w:rPr>
   </w:style>
-  <w:style w:type="paragraph" w:styleId="Subtitle">
+  <w:style w:type="paragraph" w:styleId="Altyaz">
     <w:name w:val="Subtitle"/>
     <w:basedOn w:val="Normal"/>
     <w:next w:val="Normal"/>
-    <w:link w:val="SubtitleChar"/>
+    <w:link w:val="AltyazChar"/>
     <w:uiPriority w:val="11"/>
     <w:qFormat/>
     <w:rsid w:val="00A65016"/>
@@ -5583,10 +5567,10 @@
       <w:szCs w:val="28"/>
     </w:rPr>
   </w:style>
-  <w:style w:type="character" w:customStyle="1" w:styleId="SubtitleChar">
-    <w:name w:val="Subtitle Char"/>
-    <w:basedOn w:val="DefaultParagraphFont"/>
-    <w:link w:val="Subtitle"/>
+  <w:style w:type="character" w:customStyle="1" w:styleId="AltyazChar">
+    <w:name w:val="Altyazı Char"/>
+    <w:basedOn w:val="VarsaylanParagrafYazTipi"/>
+    <w:link w:val="Altyaz"/>
     <w:uiPriority w:val="11"/>
     <w:rsid w:val="00A65016"/>
     <w:rPr>
@@ -5597,11 +5581,11 @@
       <w:szCs w:val="28"/>
     </w:rPr>
   </w:style>
-  <w:style w:type="paragraph" w:styleId="Quote">
+  <w:style w:type="paragraph" w:styleId="Alnt">
     <w:name w:val="Quote"/>
     <w:basedOn w:val="Normal"/>
     <w:next w:val="Normal"/>
-    <w:link w:val="QuoteChar"/>
+    <w:link w:val="AlntChar"/>
     <w:uiPriority w:val="29"/>
     <w:qFormat/>
     <w:rsid w:val="00A65016"/>
@@ -5615,10 +5599,10 @@
       <w:color w:val="404040" w:themeColor="text1" w:themeTint="BF"/>
     </w:rPr>
   </w:style>
-  <w:style w:type="character" w:customStyle="1" w:styleId="QuoteChar">
-    <w:name w:val="Quote Char"/>
-    <w:basedOn w:val="DefaultParagraphFont"/>
-    <w:link w:val="Quote"/>
+  <w:style w:type="character" w:customStyle="1" w:styleId="AlntChar">
+    <w:name w:val="Alıntı Char"/>
+    <w:basedOn w:val="VarsaylanParagrafYazTipi"/>
+    <w:link w:val="Alnt"/>
     <w:uiPriority w:val="29"/>
     <w:rsid w:val="00A65016"/>
     <w:rPr>
@@ -5627,7 +5611,7 @@
       <w:color w:val="404040" w:themeColor="text1" w:themeTint="BF"/>
     </w:rPr>
   </w:style>
-  <w:style w:type="paragraph" w:styleId="ListParagraph">
+  <w:style w:type="paragraph" w:styleId="ListeParagraf">
     <w:name w:val="List Paragraph"/>
     <w:basedOn w:val="Normal"/>
     <w:uiPriority w:val="34"/>
@@ -5638,9 +5622,9 @@
       <w:contextualSpacing/>
     </w:pPr>
   </w:style>
-  <w:style w:type="character" w:styleId="IntenseEmphasis">
+  <w:style w:type="character" w:styleId="GlVurgulama">
     <w:name w:val="Intense Emphasis"/>
-    <w:basedOn w:val="DefaultParagraphFont"/>
+    <w:basedOn w:val="VarsaylanParagrafYazTipi"/>
     <w:uiPriority w:val="21"/>
     <w:qFormat/>
     <w:rsid w:val="00A65016"/>
@@ -5650,11 +5634,11 @@
       <w:color w:val="0F4761" w:themeColor="accent1" w:themeShade="BF"/>
     </w:rPr>
   </w:style>
-  <w:style w:type="paragraph" w:styleId="IntenseQuote">
+  <w:style w:type="paragraph" w:styleId="GlAlnt">
     <w:name w:val="Intense Quote"/>
     <w:basedOn w:val="Normal"/>
     <w:next w:val="Normal"/>
-    <w:link w:val="IntenseQuoteChar"/>
+    <w:link w:val="GlAlntChar"/>
     <w:uiPriority w:val="30"/>
     <w:qFormat/>
     <w:rsid w:val="00A65016"/>
@@ -5673,10 +5657,10 @@
       <w:color w:val="0F4761" w:themeColor="accent1" w:themeShade="BF"/>
     </w:rPr>
   </w:style>
-  <w:style w:type="character" w:customStyle="1" w:styleId="IntenseQuoteChar">
-    <w:name w:val="Intense Quote Char"/>
-    <w:basedOn w:val="DefaultParagraphFont"/>
-    <w:link w:val="IntenseQuote"/>
+  <w:style w:type="character" w:customStyle="1" w:styleId="GlAlntChar">
+    <w:name w:val="Güçlü Alıntı Char"/>
+    <w:basedOn w:val="VarsaylanParagrafYazTipi"/>
+    <w:link w:val="GlAlnt"/>
     <w:uiPriority w:val="30"/>
     <w:rsid w:val="00A65016"/>
     <w:rPr>
@@ -5685,9 +5669,9 @@
       <w:color w:val="0F4761" w:themeColor="accent1" w:themeShade="BF"/>
     </w:rPr>
   </w:style>
-  <w:style w:type="character" w:styleId="IntenseReference">
+  <w:style w:type="character" w:styleId="GlBavuru">
     <w:name w:val="Intense Reference"/>
-    <w:basedOn w:val="DefaultParagraphFont"/>
+    <w:basedOn w:val="VarsaylanParagrafYazTipi"/>
     <w:uiPriority w:val="32"/>
     <w:qFormat/>
     <w:rsid w:val="00A65016"/>

</xml_diff>